<commit_message>
Implement ingestion review workflow improvements
</commit_message>
<xml_diff>
--- a/docs/Prudentia-AI-End-User-Walkthrough.docx
+++ b/docs/Prudentia-AI-End-User-Walkthrough.docx
@@ -164,7 +164,7 @@
                 <w:color w:val="1C2530"/>
                 <w:sz w:val="19"/>
               </w:rPr>
-              <w:t>Members, contributors, reviewers, auditors, space admins, system admins, and platform admins</w:t>
+              <w:t>Chat Members, Document Contributors, Audit Viewers, Space Admins, System Admins, and Platform Admins</w:t>
             </w:r>
           </w:p>
         </w:tc>
@@ -218,7 +218,7 @@
                 <w:color w:val="1C2530"/>
                 <w:sz w:val="19"/>
               </w:rPr>
-              <w:t>Document and live-data queries, connectors, ingestion profiles, optional GraphRAG, evidence, activity, governance, and Configs</w:t>
+              <w:t>Document and live-data queries, connectors, ingestion profiles, optional GraphRAG, evidence, activity, governance, and Runtime Settings</w:t>
             </w:r>
           </w:p>
         </w:tc>
@@ -326,7 +326,7 @@
                 <w:color w:val="1C2530"/>
                 <w:sz w:val="19"/>
               </w:rPr>
-              <w:t>2026-06-23</w:t>
+              <w:t>2026-07-07</w:t>
             </w:r>
           </w:p>
         </w:tc>
@@ -427,7 +427,7 @@
                 <w:color w:val="1C2530"/>
                 <w:sz w:val="21"/>
               </w:rPr>
-              <w:t>Your sidebar is permission-aware. If a feature described here does not appear, your account does not include that permission. Connector governance and Configs are included for administrators who can see those pages.</w:t>
+              <w:t>Your sidebar is permission-aware. If a feature described here does not appear, your account does not include that permission. Connector governance and Runtime Settings are included for administrators who can see those pages.</w:t>
             </w:r>
           </w:p>
         </w:tc>
@@ -507,6 +507,472 @@
         </w:rPr>
         <w:t>Use Add Files, Activity, Review Queue, or Audit only when those pages appear in your sidebar.</w:t>
       </w:r>
+    </w:p>
+    <w:p>
+      <w:pPr>
+        <w:pStyle w:val="Heading1"/>
+      </w:pPr>
+      <w:r>
+        <w:t>Know Your Account Type</w:t>
+      </w:r>
+    </w:p>
+    <w:p>
+      <w:pPr>
+        <w:spacing w:after="120" w:line="300" w:lineRule="auto"/>
+      </w:pPr>
+      <w:r>
+        <w:rPr>
+          <w:rFonts w:ascii="Calibri" w:hAnsi="Calibri"/>
+          <w:color w:val="1C2530"/>
+          <w:sz w:val="22"/>
+        </w:rPr>
+        <w:t>Your account type controls which pages and actions appear. Knowledge Space membership and clearance still limit what you can see inside those pages.</w:t>
+      </w:r>
+    </w:p>
+    <w:tbl>
+      <w:tblPr>
+        <w:tblStyle w:val="TableGrid"/>
+        <w:tblW w:type="dxa" w:w="9360"/>
+        <w:jc w:val="left"/>
+        <w:tblLook w:firstColumn="1" w:firstRow="1" w:lastColumn="0" w:lastRow="0" w:noHBand="0" w:noVBand="1" w:val="04A0"/>
+        <w:tblInd w:type="dxa" w:w="120"/>
+      </w:tblPr>
+      <w:tblGrid>
+        <w:gridCol w:w="2300"/>
+        <w:gridCol w:w="7060"/>
+      </w:tblGrid>
+      <w:tr>
+        <w:trPr>
+          <w:tblHeader w:val="true"/>
+        </w:trPr>
+        <w:tc>
+          <w:tcPr>
+            <w:tcW w:type="dxa" w:w="2300"/>
+            <w:vAlign w:val="center"/>
+            <w:tcMar>
+              <w:top w:w="80" w:type="dxa"/>
+              <w:bottom w:w="80" w:type="dxa"/>
+              <w:start w:w="120" w:type="dxa"/>
+              <w:end w:w="120" w:type="dxa"/>
+            </w:tcMar>
+            <w:shd w:fill="E8EEF5"/>
+          </w:tcPr>
+          <w:p>
+            <w:pPr>
+              <w:spacing w:before="0" w:after="0" w:line="276" w:lineRule="auto"/>
+            </w:pPr>
+            <w:r>
+              <w:rPr>
+                <w:rFonts w:ascii="Calibri" w:hAnsi="Calibri"/>
+                <w:b/>
+                <w:color w:val="1C2530"/>
+                <w:sz w:val="20"/>
+              </w:rPr>
+              <w:t>Account type</w:t>
+            </w:r>
+          </w:p>
+        </w:tc>
+        <w:tc>
+          <w:tcPr>
+            <w:tcW w:type="dxa" w:w="7060"/>
+            <w:vAlign w:val="center"/>
+            <w:tcMar>
+              <w:top w:w="80" w:type="dxa"/>
+              <w:bottom w:w="80" w:type="dxa"/>
+              <w:start w:w="120" w:type="dxa"/>
+              <w:end w:w="120" w:type="dxa"/>
+            </w:tcMar>
+            <w:shd w:fill="E8EEF5"/>
+          </w:tcPr>
+          <w:p>
+            <w:pPr>
+              <w:spacing w:before="0" w:after="0" w:line="276" w:lineRule="auto"/>
+            </w:pPr>
+            <w:r>
+              <w:rPr>
+                <w:rFonts w:ascii="Calibri" w:hAnsi="Calibri"/>
+                <w:b/>
+                <w:color w:val="1C2530"/>
+                <w:sz w:val="20"/>
+              </w:rPr>
+              <w:t>Typical access</w:t>
+            </w:r>
+          </w:p>
+        </w:tc>
+      </w:tr>
+      <w:tr>
+        <w:tc>
+          <w:tcPr>
+            <w:tcW w:type="dxa" w:w="2300"/>
+            <w:vAlign w:val="center"/>
+            <w:tcMar>
+              <w:top w:w="80" w:type="dxa"/>
+              <w:bottom w:w="80" w:type="dxa"/>
+              <w:start w:w="120" w:type="dxa"/>
+              <w:end w:w="120" w:type="dxa"/>
+            </w:tcMar>
+          </w:tcPr>
+          <w:p>
+            <w:pPr>
+              <w:spacing w:before="0" w:after="0" w:line="276" w:lineRule="auto"/>
+            </w:pPr>
+            <w:r>
+              <w:rPr>
+                <w:rFonts w:ascii="Calibri" w:hAnsi="Calibri"/>
+                <w:b w:val="0"/>
+                <w:color w:val="1C2530"/>
+                <w:sz w:val="20"/>
+              </w:rPr>
+              <w:t>Platform Admin</w:t>
+            </w:r>
+          </w:p>
+        </w:tc>
+        <w:tc>
+          <w:tcPr>
+            <w:tcW w:type="dxa" w:w="7060"/>
+            <w:vAlign w:val="center"/>
+            <w:tcMar>
+              <w:top w:w="80" w:type="dxa"/>
+              <w:bottom w:w="80" w:type="dxa"/>
+              <w:start w:w="120" w:type="dxa"/>
+              <w:end w:w="120" w:type="dxa"/>
+            </w:tcMar>
+          </w:tcPr>
+          <w:p>
+            <w:pPr>
+              <w:spacing w:before="0" w:after="0" w:line="276" w:lineRule="auto"/>
+            </w:pPr>
+            <w:r>
+              <w:rPr>
+                <w:rFonts w:ascii="Calibri" w:hAnsi="Calibri"/>
+                <w:b w:val="0"/>
+                <w:color w:val="1C2530"/>
+                <w:sz w:val="20"/>
+              </w:rPr>
+              <w:t>Full platform ownership: users, spaces, Runtime Settings, RAG Evaluation, audit, connectors, uploads, review, and documents.</w:t>
+            </w:r>
+          </w:p>
+        </w:tc>
+      </w:tr>
+      <w:tr>
+        <w:tc>
+          <w:tcPr>
+            <w:tcW w:type="dxa" w:w="2300"/>
+            <w:vAlign w:val="center"/>
+            <w:tcMar>
+              <w:top w:w="80" w:type="dxa"/>
+              <w:bottom w:w="80" w:type="dxa"/>
+              <w:start w:w="120" w:type="dxa"/>
+              <w:end w:w="120" w:type="dxa"/>
+            </w:tcMar>
+          </w:tcPr>
+          <w:p>
+            <w:pPr>
+              <w:spacing w:before="0" w:after="0" w:line="276" w:lineRule="auto"/>
+            </w:pPr>
+            <w:r>
+              <w:rPr>
+                <w:rFonts w:ascii="Calibri" w:hAnsi="Calibri"/>
+                <w:b w:val="0"/>
+                <w:color w:val="1C2530"/>
+                <w:sz w:val="20"/>
+              </w:rPr>
+              <w:t>System Admin</w:t>
+            </w:r>
+          </w:p>
+        </w:tc>
+        <w:tc>
+          <w:tcPr>
+            <w:tcW w:type="dxa" w:w="7060"/>
+            <w:vAlign w:val="center"/>
+            <w:tcMar>
+              <w:top w:w="80" w:type="dxa"/>
+              <w:bottom w:w="80" w:type="dxa"/>
+              <w:start w:w="120" w:type="dxa"/>
+              <w:end w:w="120" w:type="dxa"/>
+            </w:tcMar>
+          </w:tcPr>
+          <w:p>
+            <w:pPr>
+              <w:spacing w:before="0" w:after="0" w:line="276" w:lineRule="auto"/>
+            </w:pPr>
+            <w:r>
+              <w:rPr>
+                <w:rFonts w:ascii="Calibri" w:hAnsi="Calibri"/>
+                <w:b w:val="0"/>
+                <w:color w:val="1C2530"/>
+                <w:sz w:val="20"/>
+              </w:rPr>
+              <w:t>Global operations: users except Platform Admins, spaces, documents, uploads, review, audit, and recovery.</w:t>
+            </w:r>
+          </w:p>
+        </w:tc>
+      </w:tr>
+      <w:tr>
+        <w:tc>
+          <w:tcPr>
+            <w:tcW w:type="dxa" w:w="2300"/>
+            <w:vAlign w:val="center"/>
+            <w:tcMar>
+              <w:top w:w="80" w:type="dxa"/>
+              <w:bottom w:w="80" w:type="dxa"/>
+              <w:start w:w="120" w:type="dxa"/>
+              <w:end w:w="120" w:type="dxa"/>
+            </w:tcMar>
+          </w:tcPr>
+          <w:p>
+            <w:pPr>
+              <w:spacing w:before="0" w:after="0" w:line="276" w:lineRule="auto"/>
+            </w:pPr>
+            <w:r>
+              <w:rPr>
+                <w:rFonts w:ascii="Calibri" w:hAnsi="Calibri"/>
+                <w:b w:val="0"/>
+                <w:color w:val="1C2530"/>
+                <w:sz w:val="20"/>
+              </w:rPr>
+              <w:t>Space Admin</w:t>
+            </w:r>
+          </w:p>
+        </w:tc>
+        <w:tc>
+          <w:tcPr>
+            <w:tcW w:type="dxa" w:w="7060"/>
+            <w:vAlign w:val="center"/>
+            <w:tcMar>
+              <w:top w:w="80" w:type="dxa"/>
+              <w:bottom w:w="80" w:type="dxa"/>
+              <w:start w:w="120" w:type="dxa"/>
+              <w:end w:w="120" w:type="dxa"/>
+            </w:tcMar>
+          </w:tcPr>
+          <w:p>
+            <w:pPr>
+              <w:spacing w:before="0" w:after="0" w:line="276" w:lineRule="auto"/>
+            </w:pPr>
+            <w:r>
+              <w:rPr>
+                <w:rFonts w:ascii="Calibri" w:hAnsi="Calibri"/>
+                <w:b w:val="0"/>
+                <w:color w:val="1C2530"/>
+                <w:sz w:val="20"/>
+              </w:rPr>
+              <w:t>Assigned-space administration: scoped users, spaces, uploads, review, folder sources, connectors, and document lifecycle.</w:t>
+            </w:r>
+          </w:p>
+        </w:tc>
+      </w:tr>
+      <w:tr>
+        <w:tc>
+          <w:tcPr>
+            <w:tcW w:type="dxa" w:w="2300"/>
+            <w:vAlign w:val="center"/>
+            <w:tcMar>
+              <w:top w:w="80" w:type="dxa"/>
+              <w:bottom w:w="80" w:type="dxa"/>
+              <w:start w:w="120" w:type="dxa"/>
+              <w:end w:w="120" w:type="dxa"/>
+            </w:tcMar>
+          </w:tcPr>
+          <w:p>
+            <w:pPr>
+              <w:spacing w:before="0" w:after="0" w:line="276" w:lineRule="auto"/>
+            </w:pPr>
+            <w:r>
+              <w:rPr>
+                <w:rFonts w:ascii="Calibri" w:hAnsi="Calibri"/>
+                <w:b w:val="0"/>
+                <w:color w:val="1C2530"/>
+                <w:sz w:val="20"/>
+              </w:rPr>
+              <w:t>Document Contributor</w:t>
+            </w:r>
+          </w:p>
+        </w:tc>
+        <w:tc>
+          <w:tcPr>
+            <w:tcW w:type="dxa" w:w="7060"/>
+            <w:vAlign w:val="center"/>
+            <w:tcMar>
+              <w:top w:w="80" w:type="dxa"/>
+              <w:bottom w:w="80" w:type="dxa"/>
+              <w:start w:w="120" w:type="dxa"/>
+              <w:end w:w="120" w:type="dxa"/>
+            </w:tcMar>
+          </w:tcPr>
+          <w:p>
+            <w:pPr>
+              <w:spacing w:before="0" w:after="0" w:line="276" w:lineRule="auto"/>
+            </w:pPr>
+            <w:r>
+              <w:rPr>
+                <w:rFonts w:ascii="Calibri" w:hAnsi="Calibri"/>
+                <w:b w:val="0"/>
+                <w:color w:val="1C2530"/>
+                <w:sz w:val="20"/>
+              </w:rPr>
+              <w:t>Document work: chat, upload, track ingestion, resolve Review Queue items, and maintain writable documents.</w:t>
+            </w:r>
+          </w:p>
+        </w:tc>
+      </w:tr>
+      <w:tr>
+        <w:tc>
+          <w:tcPr>
+            <w:tcW w:type="dxa" w:w="2300"/>
+            <w:vAlign w:val="center"/>
+            <w:tcMar>
+              <w:top w:w="80" w:type="dxa"/>
+              <w:bottom w:w="80" w:type="dxa"/>
+              <w:start w:w="120" w:type="dxa"/>
+              <w:end w:w="120" w:type="dxa"/>
+            </w:tcMar>
+          </w:tcPr>
+          <w:p>
+            <w:pPr>
+              <w:spacing w:before="0" w:after="0" w:line="276" w:lineRule="auto"/>
+            </w:pPr>
+            <w:r>
+              <w:rPr>
+                <w:rFonts w:ascii="Calibri" w:hAnsi="Calibri"/>
+                <w:b w:val="0"/>
+                <w:color w:val="1C2530"/>
+                <w:sz w:val="20"/>
+              </w:rPr>
+              <w:t>Chat Member</w:t>
+            </w:r>
+          </w:p>
+        </w:tc>
+        <w:tc>
+          <w:tcPr>
+            <w:tcW w:type="dxa" w:w="7060"/>
+            <w:vAlign w:val="center"/>
+            <w:tcMar>
+              <w:top w:w="80" w:type="dxa"/>
+              <w:bottom w:w="80" w:type="dxa"/>
+              <w:start w:w="120" w:type="dxa"/>
+              <w:end w:w="120" w:type="dxa"/>
+            </w:tcMar>
+          </w:tcPr>
+          <w:p>
+            <w:pPr>
+              <w:spacing w:before="0" w:after="0" w:line="276" w:lineRule="auto"/>
+            </w:pPr>
+            <w:r>
+              <w:rPr>
+                <w:rFonts w:ascii="Calibri" w:hAnsi="Calibri"/>
+                <w:b w:val="0"/>
+                <w:color w:val="1C2530"/>
+                <w:sz w:val="20"/>
+              </w:rPr>
+              <w:t>Everyday use: chat with visible documents, scope questions, inspect evidence, and browse visible library metadata.</w:t>
+            </w:r>
+          </w:p>
+        </w:tc>
+      </w:tr>
+      <w:tr>
+        <w:tc>
+          <w:tcPr>
+            <w:tcW w:type="dxa" w:w="2300"/>
+            <w:vAlign w:val="center"/>
+            <w:tcMar>
+              <w:top w:w="80" w:type="dxa"/>
+              <w:bottom w:w="80" w:type="dxa"/>
+              <w:start w:w="120" w:type="dxa"/>
+              <w:end w:w="120" w:type="dxa"/>
+            </w:tcMar>
+          </w:tcPr>
+          <w:p>
+            <w:pPr>
+              <w:spacing w:before="0" w:after="0" w:line="276" w:lineRule="auto"/>
+            </w:pPr>
+            <w:r>
+              <w:rPr>
+                <w:rFonts w:ascii="Calibri" w:hAnsi="Calibri"/>
+                <w:b w:val="0"/>
+                <w:color w:val="1C2530"/>
+                <w:sz w:val="20"/>
+              </w:rPr>
+              <w:t>Audit Viewer</w:t>
+            </w:r>
+          </w:p>
+        </w:tc>
+        <w:tc>
+          <w:tcPr>
+            <w:tcW w:type="dxa" w:w="7060"/>
+            <w:vAlign w:val="center"/>
+            <w:tcMar>
+              <w:top w:w="80" w:type="dxa"/>
+              <w:bottom w:w="80" w:type="dxa"/>
+              <w:start w:w="120" w:type="dxa"/>
+              <w:end w:w="120" w:type="dxa"/>
+            </w:tcMar>
+          </w:tcPr>
+          <w:p>
+            <w:pPr>
+              <w:spacing w:before="0" w:after="0" w:line="276" w:lineRule="auto"/>
+            </w:pPr>
+            <w:r>
+              <w:rPr>
+                <w:rFonts w:ascii="Calibri" w:hAnsi="Calibri"/>
+                <w:b w:val="0"/>
+                <w:color w:val="1C2530"/>
+                <w:sz w:val="20"/>
+              </w:rPr>
+              <w:t>Governance review: inspect visible audit events and metadata without changing system state.</w:t>
+            </w:r>
+          </w:p>
+        </w:tc>
+      </w:tr>
+    </w:tbl>
+    <w:p>
+      <w:pPr>
+        <w:spacing w:after="40"/>
+      </w:pPr>
+    </w:p>
+    <w:tbl>
+      <w:tblPr>
+        <w:tblW w:type="dxa" w:w="9360"/>
+        <w:jc w:val="left"/>
+        <w:tblLook w:firstColumn="1" w:firstRow="1" w:lastColumn="0" w:lastRow="0" w:noHBand="0" w:noVBand="1" w:val="04A0"/>
+        <w:tblInd w:type="dxa" w:w="160"/>
+      </w:tblPr>
+      <w:tblGrid>
+        <w:gridCol w:w="9360"/>
+      </w:tblGrid>
+      <w:tr>
+        <w:tc>
+          <w:tcPr>
+            <w:tcW w:type="dxa" w:w="9360"/>
+            <w:shd w:fill="F4F6F9"/>
+            <w:tcMar>
+              <w:top w:w="120" w:type="dxa"/>
+              <w:bottom w:w="120" w:type="dxa"/>
+              <w:start w:w="160" w:type="dxa"/>
+              <w:end w:w="160" w:type="dxa"/>
+            </w:tcMar>
+          </w:tcPr>
+          <w:p>
+            <w:pPr>
+              <w:spacing w:after="0"/>
+            </w:pPr>
+            <w:r>
+              <w:rPr>
+                <w:rFonts w:ascii="Calibri" w:hAnsi="Calibri"/>
+                <w:b/>
+                <w:color w:val="1C2530"/>
+                <w:sz w:val="21"/>
+              </w:rPr>
+              <w:t>Legacy User Manager and Reviewer records may exist in older data. New assignments use Space Admin for scoped user management and Document Contributor for upload plus review.</w:t>
+            </w:r>
+          </w:p>
+        </w:tc>
+      </w:tr>
+    </w:tbl>
+    <w:p>
+      <w:pPr>
+        <w:spacing w:after="40"/>
+      </w:pPr>
     </w:p>
     <w:p>
       <w:pPr>
@@ -1237,7 +1703,7 @@
                 <w:color w:val="1C2530"/>
                 <w:sz w:val="20"/>
               </w:rPr>
-              <w:t>Correct low-confidence OCR blocks before indexing continues.</w:t>
+              <w:t>Resolve OCR blocks and PDF image-analysis holds before indexing continues.</w:t>
             </w:r>
           </w:p>
         </w:tc>
@@ -1371,7 +1837,7 @@
                 <w:color w:val="1C2530"/>
                 <w:sz w:val="20"/>
               </w:rPr>
-              <w:t>Configs</w:t>
+              <w:t>Runtime Settings</w:t>
             </w:r>
           </w:p>
         </w:tc>
@@ -1397,7 +1863,7 @@
                 <w:color w:val="1C2530"/>
                 <w:sz w:val="20"/>
               </w:rPr>
-              <w:t>Assign inference roles, tune services, and choose ingestion defaults.</w:t>
+              <w:t>Assign inference roles, tune services, and manage ingestion controls.</w:t>
             </w:r>
           </w:p>
         </w:tc>
@@ -1423,7 +1889,7 @@
                 <w:color w:val="1C2530"/>
                 <w:sz w:val="20"/>
               </w:rPr>
-              <w:t>Govern &gt; Configs</w:t>
+              <w:t>Govern &gt; Runtime Settings</w:t>
             </w:r>
           </w:p>
         </w:tc>
@@ -3202,7 +3668,7 @@
                 <w:color w:val="1C2530"/>
                 <w:sz w:val="20"/>
               </w:rPr>
-              <w:t>Paused for human OCR or extraction review.</w:t>
+              <w:t>Paused for human OCR, extraction, or PDF image review.</w:t>
             </w:r>
           </w:p>
         </w:tc>
@@ -3723,7 +4189,7 @@
           <w:color w:val="1C2530"/>
           <w:sz w:val="22"/>
         </w:rPr>
-        <w:t>Click Schema to inspect tables, columns, relationships, indexes, and raw schema JSON.</w:t>
+        <w:t>Click Read Schema to inspect tables, columns, relationships, indexes, and raw schema JSON.</w:t>
       </w:r>
     </w:p>
     <w:p>
@@ -3737,7 +4203,7 @@
           <w:color w:val="1C2530"/>
           <w:sz w:val="22"/>
         </w:rPr>
-        <w:t>Create an AI draft, then correct its catalog name, business rules, descriptions, synonyms, allowed fields, and sensitivity flags.</w:t>
+        <w:t>Click Prepare Review, then correct the catalog name, business rules, descriptions, synonyms, allowed fields, and sensitivity flags.</w:t>
       </w:r>
     </w:p>
     <w:p>
@@ -3751,7 +4217,7 @@
           <w:color w:val="1C2530"/>
           <w:sz w:val="22"/>
         </w:rPr>
-        <w:t>Assign the correct Knowledge Space and clearance, then Approve Scope.</w:t>
+        <w:t>Assign the owner Knowledge Space, optional shared Knowledge Spaces, and clearance, then Enable Live DB Access after review.</w:t>
       </w:r>
     </w:p>
     <w:p>
@@ -3817,7 +4283,7 @@
         <w:pStyle w:val="Heading1"/>
       </w:pPr>
       <w:r>
-        <w:t>Review OCR Blocks</w:t>
+        <w:t>Use Review Queue</w:t>
       </w:r>
     </w:p>
     <w:p>
@@ -3830,7 +4296,15 @@
           <w:color w:val="1C2530"/>
           <w:sz w:val="22"/>
         </w:rPr>
-        <w:t>If Review Queue appears in your sidebar, use it to resolve low-confidence OCR before indexing continues.</w:t>
+        <w:t>If Review Queue appears in your sidebar, use it to resolve OCR blocks and PDF image-analysis holds before indexing continues.</w:t>
+      </w:r>
+    </w:p>
+    <w:p>
+      <w:pPr>
+        <w:pStyle w:val="Heading2"/>
+      </w:pPr>
+      <w:r>
+        <w:t>OCR Blocks</w:t>
       </w:r>
     </w:p>
     <w:p>
@@ -3844,7 +4318,7 @@
           <w:color w:val="1C2530"/>
           <w:sz w:val="22"/>
         </w:rPr>
-        <w:t>Open Review Queue.</w:t>
+        <w:t>Open Review Queue and choose OCR blocks.</w:t>
       </w:r>
     </w:p>
     <w:p>
@@ -3903,6 +4377,70 @@
         <w:t>Click Approve correction to save, or Reject block if it should not continue.</w:t>
       </w:r>
     </w:p>
+    <w:p>
+      <w:pPr>
+        <w:pStyle w:val="Heading2"/>
+      </w:pPr>
+      <w:r>
+        <w:t>PDF Images</w:t>
+      </w:r>
+    </w:p>
+    <w:p>
+      <w:pPr>
+        <w:pStyle w:val="ListNumber"/>
+        <w:spacing w:after="80" w:line="300" w:lineRule="auto"/>
+      </w:pPr>
+      <w:r>
+        <w:rPr>
+          <w:rFonts w:ascii="Calibri" w:hAnsi="Calibri"/>
+          <w:color w:val="1C2530"/>
+          <w:sz w:val="22"/>
+        </w:rPr>
+        <w:t>Choose PDF images.</w:t>
+      </w:r>
+    </w:p>
+    <w:p>
+      <w:pPr>
+        <w:pStyle w:val="ListNumber"/>
+        <w:spacing w:after="80" w:line="300" w:lineRule="auto"/>
+      </w:pPr>
+      <w:r>
+        <w:rPr>
+          <w:rFonts w:ascii="Calibri" w:hAnsi="Calibri"/>
+          <w:color w:val="1C2530"/>
+          <w:sz w:val="22"/>
+        </w:rPr>
+        <w:t>Select a held document image batch.</w:t>
+      </w:r>
+    </w:p>
+    <w:p>
+      <w:pPr>
+        <w:pStyle w:val="ListNumber"/>
+        <w:spacing w:after="80" w:line="300" w:lineRule="auto"/>
+      </w:pPr>
+      <w:r>
+        <w:rPr>
+          <w:rFonts w:ascii="Calibri" w:hAnsi="Calibri"/>
+          <w:color w:val="1C2530"/>
+          <w:sz w:val="22"/>
+        </w:rPr>
+        <w:t>Review candidate thumbnails and recommended markers.</w:t>
+      </w:r>
+    </w:p>
+    <w:p>
+      <w:pPr>
+        <w:pStyle w:val="ListNumber"/>
+        <w:spacing w:after="80" w:line="300" w:lineRule="auto"/>
+      </w:pPr>
+      <w:r>
+        <w:rPr>
+          <w:rFonts w:ascii="Calibri" w:hAnsi="Calibri"/>
+          <w:color w:val="1C2530"/>
+          <w:sz w:val="22"/>
+        </w:rPr>
+        <w:t>Choose Analyze selected, Analyze recommended, Skip selected, or Skip all pending.</w:t>
+      </w:r>
+    </w:p>
     <w:tbl>
       <w:tblPr>
         <w:tblW w:type="dxa" w:w="9360"/>
@@ -3936,7 +4474,7 @@
                 <w:color w:val="1C2530"/>
                 <w:sz w:val="21"/>
               </w:rPr>
-              <w:t>Approval requires non-empty corrected text. When the queue is clear, the page shows a ready state.</w:t>
+              <w:t>OCR approval requires non-empty corrected text. Image batches resume when no candidates remain pending.</w:t>
             </w:r>
           </w:p>
         </w:tc>
@@ -3973,7 +4511,7 @@
         <w:pStyle w:val="Heading1"/>
       </w:pPr>
       <w:r>
-        <w:t>Use Configs</w:t>
+        <w:t>Use Runtime Settings</w:t>
       </w:r>
     </w:p>
     <w:p>
@@ -3986,7 +4524,7 @@
           <w:color w:val="1C2530"/>
           <w:sz w:val="22"/>
         </w:rPr>
-        <w:t>Configs is Platform Admin-only and contains Models &amp; Roles, Inference Services, and Ingestion Worker Capacity.</w:t>
+        <w:t>Runtime Settings is Platform Admin-only under Govern and contains Models &amp; Roles, Inference Services, and Ingestion Controls.</w:t>
       </w:r>
     </w:p>
     <w:p>
@@ -4079,7 +4617,7 @@
         <w:pStyle w:val="Heading2"/>
       </w:pPr>
       <w:r>
-        <w:t>Ingestion Profiles and Worker Capacity</w:t>
+        <w:t>Ingestion Controls</w:t>
       </w:r>
     </w:p>
     <w:tbl>
@@ -4466,7 +5004,35 @@
           <w:color w:val="1C2530"/>
           <w:sz w:val="22"/>
         </w:rPr>
+        <w:t>PDF image batches above the image review threshold pause before vision analysis; set the threshold to 0 to skip this gate.</w:t>
+      </w:r>
+    </w:p>
+    <w:p>
+      <w:pPr>
+        <w:pStyle w:val="ListBullet"/>
+        <w:spacing w:after="80" w:line="300" w:lineRule="auto"/>
+      </w:pPr>
+      <w:r>
+        <w:rPr>
+          <w:rFonts w:ascii="Calibri" w:hAnsi="Calibri"/>
+          <w:color w:val="1C2530"/>
+          <w:sz w:val="22"/>
+        </w:rPr>
         <w:t>Vision layout repair re-reads complex PDF pages after Docling and trades throughput for fidelity.</w:t>
+      </w:r>
+    </w:p>
+    <w:p>
+      <w:pPr>
+        <w:pStyle w:val="ListBullet"/>
+        <w:spacing w:after="80" w:line="300" w:lineRule="auto"/>
+      </w:pPr>
+      <w:r>
+        <w:rPr>
+          <w:rFonts w:ascii="Calibri" w:hAnsi="Calibri"/>
+          <w:color w:val="1C2530"/>
+          <w:sz w:val="22"/>
+        </w:rPr>
+        <w:t>Graph enrichment controls whether completed documents expose the graph enrichment action.</w:t>
       </w:r>
     </w:p>
     <w:p>
@@ -4987,7 +5553,7 @@
                 <w:color w:val="1C2530"/>
                 <w:sz w:val="20"/>
               </w:rPr>
-              <w:t>Low-confidence OCR paused indexing.</w:t>
+              <w:t>OCR, extraction, or PDF image triage paused indexing.</w:t>
             </w:r>
           </w:p>
         </w:tc>
@@ -5013,7 +5579,7 @@
                 <w:color w:val="1C2530"/>
                 <w:sz w:val="20"/>
               </w:rPr>
-              <w:t>A reviewer should correct or reject the pending block in Review Queue.</w:t>
+              <w:t>A Document Contributor, Space Admin, System Admin, or Platform Admin should resolve the pending Review Queue item.</w:t>
             </w:r>
           </w:p>
         </w:tc>

</xml_diff>

<commit_message>
chore: checkpoint current repo cleanup state
</commit_message>
<xml_diff>
--- a/docs/Prudentia-AI-End-User-Walkthrough.docx
+++ b/docs/Prudentia-AI-End-User-Walkthrough.docx
@@ -1810,6 +1810,86 @@
                 <w:sz w:val="20"/>
               </w:rPr>
               <w:t>Govern &gt; System Audit</w:t>
+            </w:r>
+          </w:p>
+        </w:tc>
+      </w:tr>
+      <w:tr>
+        <w:tc>
+          <w:tcPr>
+            <w:tcW w:type="dxa" w:w="1900"/>
+            <w:vAlign w:val="center"/>
+            <w:tcMar>
+              <w:top w:w="80" w:type="dxa"/>
+              <w:bottom w:w="80" w:type="dxa"/>
+              <w:start w:w="120" w:type="dxa"/>
+              <w:end w:w="120" w:type="dxa"/>
+            </w:tcMar>
+          </w:tcPr>
+          <w:p>
+            <w:pPr>
+              <w:spacing w:before="0" w:after="0" w:line="276" w:lineRule="auto"/>
+            </w:pPr>
+            <w:r>
+              <w:rPr>
+                <w:rFonts w:ascii="Calibri" w:hAnsi="Calibri"/>
+                <w:b w:val="0"/>
+                <w:color w:val="1C2530"/>
+                <w:sz w:val="20"/>
+              </w:rPr>
+              <w:t>User Management</w:t>
+            </w:r>
+          </w:p>
+        </w:tc>
+        <w:tc>
+          <w:tcPr>
+            <w:tcW w:type="dxa" w:w="4660"/>
+            <w:vAlign w:val="center"/>
+            <w:tcMar>
+              <w:top w:w="80" w:type="dxa"/>
+              <w:bottom w:w="80" w:type="dxa"/>
+              <w:start w:w="120" w:type="dxa"/>
+              <w:end w:w="120" w:type="dxa"/>
+            </w:tcMar>
+          </w:tcPr>
+          <w:p>
+            <w:pPr>
+              <w:spacing w:before="0" w:after="0" w:line="276" w:lineRule="auto"/>
+            </w:pPr>
+            <w:r>
+              <w:rPr>
+                <w:rFonts w:ascii="Calibri" w:hAnsi="Calibri"/>
+                <w:b w:val="0"/>
+                <w:color w:val="1C2530"/>
+                <w:sz w:val="20"/>
+              </w:rPr>
+              <w:t>Create users, reset passwords, assign account types, spaces, and clearance when permitted.</w:t>
+            </w:r>
+          </w:p>
+        </w:tc>
+        <w:tc>
+          <w:tcPr>
+            <w:tcW w:type="dxa" w:w="2800"/>
+            <w:vAlign w:val="center"/>
+            <w:tcMar>
+              <w:top w:w="80" w:type="dxa"/>
+              <w:bottom w:w="80" w:type="dxa"/>
+              <w:start w:w="120" w:type="dxa"/>
+              <w:end w:w="120" w:type="dxa"/>
+            </w:tcMar>
+          </w:tcPr>
+          <w:p>
+            <w:pPr>
+              <w:spacing w:before="0" w:after="0" w:line="276" w:lineRule="auto"/>
+            </w:pPr>
+            <w:r>
+              <w:rPr>
+                <w:rFonts w:ascii="Calibri" w:hAnsi="Calibri"/>
+                <w:b w:val="0"/>
+                <w:color w:val="1C2530"/>
+                <w:sz w:val="20"/>
+              </w:rPr>
+              <w:t>Govern &gt; User Management</w:t>
             </w:r>
           </w:p>
         </w:tc>

</xml_diff>